<commit_message>
PwC QA-Bewerbung auf den tatsaechlichen Ausschreibungstext umgestellt
Die Stelle ist Software-Testing im PET AI Tech-Hub (Testmanagement, Automatisierung,
Edge Cases), nicht Deliverable-Qualitaetssicherung wie zunaechst angenommen.

- Analyse: echter Anforderungsabgleich mit offen benannten Luecken
  (Testautomatisierung, API-/Performance-/Sicherheitstests, agile Methoden)
- Lebenslauf: Testtaetigkeit an erster Stelle, Kenntnisse nach Testing/Tools/
  Programmierung gegliedert, optionale Zeilen als Kommentar zum Freischalten
- Anschreiben (280 Woerter): Bahnplanung als Mobilitaets- und Public-Sector-Bezug,
  Unlucky-Paths-Aufhaenger, Automatisierungsluecke offen adressiert

Co-Authored-By: Claude Fable 5 <noreply@anthropic.com>
Claude-Session: https://claude.ai/code/session_01NFzmDdTx7xreFwUrj34MfE
</commit_message>
<xml_diff>
--- a/output/Anschreiben_Pouya_Shakourpour_PwC_QA.docx
+++ b/output/Anschreiben_Pouya_Shakourpour_PwC_QA.docx
@@ -91,7 +91,7 @@
           <w:i w:val="0"/>
           <w:sz w:val="21"/>
         </w:rPr>
-        <w:t>Geschäftsbereich Transformation – Public Sector &amp; Energy</w:t>
+        <w:t>Geschäftsbereich Transformation – Public &amp; Energy Transformation</w:t>
       </w:r>
     </w:p>
     <w:p>
@@ -171,7 +171,7 @@
           <w:i w:val="0"/>
           <w:sz w:val="21"/>
         </w:rPr>
-        <w:t>meine bisherige Arbeit hat wenig mit Beratung zu tun und ziemlich viel mit dem, worüber im Public Sector beraten wird. Drei Jahre lang habe ich im Baustoffgroßhandel Tiefbauunternehmen beliefert – Kanal, Leitungsbau, Straße. Seit Dezember arbeite ich in der Qualitätssicherung eines Softwarehauses, dessen Programme Planungsingenieure für Bahntrassen einsetzen. Öffentliche Infrastruktur kenne ich damit von der Seite, auf der sie tatsächlich entsteht: mit Lieferterminen, Planungsständen und Beteiligten, die alle etwas anderes für dringend halten.</w:t>
+        <w:t>die Software, die ich seit Dezember teste, nutzen Planungsingenieure für Bahntrassen. Öffentliche Auftraggeber, Infrastruktur, Mobilität – das ist ungefähr das Themenfeld, in dem Ihr PET AI Tech-Hub arbeitet, nur von der Softwareseite statt aus der Beratung. Qualitätssicherung mache ich also bereits; ich würde sie gern dort machen, wo die Ergebnisse in Digitalisierungs- und Energieprojekten der öffentlichen Hand landen.</w:t>
       </w:r>
     </w:p>
     <w:p>
@@ -185,7 +185,7 @@
           <w:i w:val="0"/>
           <w:sz w:val="21"/>
         </w:rPr>
-        <w:t>Qualitätssicherung ist dabei mein Tagesgeschäft und nicht nur eine Bezeichnung im Vertrag. Ich teste und nehme neue Softwarefunktionen ab, dokumentiere Abweichungen nachvollziehbar in Azure DevOps und halte sie nach, bis sie geklärt sind. Der zweite Teil ist die Produktdokumentation für zwei Produkte: prüfen, ob Beschreibungen vollständig und in sich schlüssig sind und ob ein Anwender ohne Software-Hintergrund damit zurechtkommt. Gelernt habe ich dabei vor allem eines – Qualitätsmängel fallen selten dadurch auf, dass etwas offensichtlich falsch ist, sondern dadurch, dass man eine Stelle zweimal lesen muss.</w:t>
+        <w:t>Mein Tagesgeschäft ist Test und Abnahme neuer Funktionen für zwei Produkte. Abweichungen beschreibe ich so, dass die Entwicklung sie reproduzieren kann, dokumentiere sie in Azure DevOps und halte sie nach, bis sie geklärt sind – Jira und TestRail bilden denselben Ablauf ab. Ihr Punkt zu den Unlucky Paths beschreibt dabei ziemlich genau, was den Reiz an der Arbeit ausmacht: Auf dem erwarteten Weg funktioniert fast alles. Interessant wird es bei der Trassenführung mit ungewöhnlicher Geometrie, dem unvollständigen Datensatz, der Eingabe, an die beim Entwurf niemand gedacht hat. Diese Fälle zu suchen, liegt mir.</w:t>
       </w:r>
     </w:p>
     <w:p>
@@ -199,7 +199,7 @@
           <w:i w:val="0"/>
           <w:sz w:val="21"/>
         </w:rPr>
-        <w:t>An der Stelle reizt mich, dass Qualitätssicherung nicht am Ende eines Projekts steht, sondern im crossfunktionalen Team zwischen Business, Technologie und Beratung stattfindet. Diese Schnittstellenarbeit mache ich im Kleinen bereits: Anforderungen zwischen Entwicklung und Fachbereich abstimmen, offene Punkte nachhalten, Inhalte so aufbereiten, dass beide Seiten damit arbeiten können. Im Großhandel war es dasselbe Muster, nur zwischen Vertrieb, Lager und Einkauf.</w:t>
+        <w:t>Zum Stand der Automatisierung sage ich lieber, wie es ist: Ich teste heute manuell. Mit Selenium oder Cypress habe ich noch nicht produktiv gearbeitet, Python und C# beherrsche ich auf Grundlagenniveau. Was ich mitbringe, ist das Handwerk dahinter – Testfälle durchdenken, Fehler sauber belegen, Ergebnisse nachvollziehbar dokumentieren – und das wende ich täglich an. Den Schritt zum automatisierten Testen möchte ich als Nächstes gehen, und dafür ist ein cross-funktionales Team mit echten Projekten der bessere Ort als ein Onlinekurs.</w:t>
       </w:r>
     </w:p>
     <w:p>
@@ -213,7 +213,7 @@
           <w:i w:val="0"/>
           <w:sz w:val="21"/>
         </w:rPr>
-        <w:t>Mein Studium des Wirtschaftsingenieurwesens und die kaufmännische Ausbildung davor bringen die technische und die wirtschaftliche Perspektive zusammen – in Infrastruktur- und Energieprojekten werden beide gebraucht. Dass ich gründlich arbeite, habe ich dort gezeigt, wo Ungenauigkeiten unmittelbar teuer werden: bei Lieferungen für laufende Baustellen und in Software, mit der andere ihre Planung machen.</w:t>
+        <w:t>Dazu kommt ein Hintergrund, den in einem Testteam nicht alle haben: kaufmännische Ausbildung, drei Jahre Baustoffgroßhandel für Tiefbauunternehmen, jetzt Wirtschaftsingenieurwesen. Ich kenne die Projekte, für die solche Software am Ende gebaut wird – das hilft beim Testen fachlicher Randfälle mehr als jede zusätzliche Toolkenntnis.</w:t>
       </w:r>
     </w:p>
     <w:p>

</xml_diff>